<commit_message>
feat(docs): improve word template tag parsing
Update `docGenerator` to better handle fragmented XML tags caused by Word's spell-check and add automatic handling for NUNC placeholder mapping in grid templates.
</commit_message>
<xml_diff>
--- a/public/PLANTILLA CITACION.docx
+++ b/public/PLANTILLA CITACION.docx
@@ -322,6 +322,7 @@
                 <w:rFonts w:cs="Arial"/>
               </w:rPr>
             </w:pPr>
+            <w:bookmarkStart w:id="0" w:name="_GoBack" w:colFirst="14" w:colLast="34"/>
           </w:p>
         </w:tc>
         <w:tc>
@@ -574,12 +575,14 @@
               <w:rPr>
                 <w:rFonts w:cs="Arial"/>
                 <w:b/>
+                <w:szCs w:val="24"/>
               </w:rPr>
             </w:pPr>
             <w:r>
               <w:rPr>
                 <w:rFonts w:cs="Arial"/>
                 <w:b/>
+                <w:szCs w:val="24"/>
               </w:rPr>
               <w:t>{NUNC_0}</w:t>
             </w:r>
@@ -602,12 +605,14 @@
               <w:rPr>
                 <w:rFonts w:cs="Arial"/>
                 <w:b/>
+                <w:szCs w:val="24"/>
               </w:rPr>
             </w:pPr>
             <w:r>
               <w:rPr>
                 <w:rFonts w:cs="Arial"/>
                 <w:b/>
+                <w:szCs w:val="24"/>
               </w:rPr>
               <w:t>{NUNC_1}</w:t>
             </w:r>
@@ -630,12 +635,14 @@
               <w:rPr>
                 <w:rFonts w:cs="Arial"/>
                 <w:b/>
+                <w:szCs w:val="24"/>
               </w:rPr>
             </w:pPr>
             <w:r>
               <w:rPr>
                 <w:rFonts w:cs="Arial"/>
                 <w:b/>
+                <w:szCs w:val="24"/>
               </w:rPr>
               <w:t>{NUNC_2}</w:t>
             </w:r>
@@ -658,6 +665,7 @@
               <w:rPr>
                 <w:rFonts w:cs="Arial"/>
                 <w:b/>
+                <w:szCs w:val="24"/>
               </w:rPr>
             </w:pPr>
             <w:r>
@@ -665,7 +673,7 @@
                 <w:rFonts w:eastAsia="Tahoma"/>
                 <w:b/>
                 <w:spacing w:val="-1"/>
-                <w:szCs w:val="16"/>
+                <w:szCs w:val="24"/>
               </w:rPr>
               <w:t>{NUNC_3}</w:t>
             </w:r>
@@ -688,6 +696,7 @@
               <w:rPr>
                 <w:rFonts w:cs="Arial"/>
                 <w:b/>
+                <w:szCs w:val="24"/>
               </w:rPr>
             </w:pPr>
             <w:r>
@@ -695,7 +704,7 @@
                 <w:rFonts w:eastAsia="Tahoma"/>
                 <w:b/>
                 <w:spacing w:val="-1"/>
-                <w:szCs w:val="16"/>
+                <w:szCs w:val="24"/>
               </w:rPr>
               <w:t>{NUNC_4}</w:t>
             </w:r>
@@ -718,6 +727,7 @@
               <w:rPr>
                 <w:rFonts w:cs="Arial"/>
                 <w:b/>
+                <w:szCs w:val="24"/>
               </w:rPr>
             </w:pPr>
             <w:r>
@@ -725,7 +735,7 @@
                 <w:rFonts w:eastAsia="Tahoma"/>
                 <w:b/>
                 <w:spacing w:val="-1"/>
-                <w:szCs w:val="16"/>
+                <w:szCs w:val="24"/>
               </w:rPr>
               <w:t>{NUNC_5}</w:t>
             </w:r>
@@ -748,6 +758,7 @@
               <w:rPr>
                 <w:rFonts w:cs="Arial"/>
                 <w:b/>
+                <w:szCs w:val="24"/>
               </w:rPr>
             </w:pPr>
             <w:r>
@@ -755,7 +766,7 @@
                 <w:rFonts w:eastAsia="Tahoma"/>
                 <w:b/>
                 <w:spacing w:val="-1"/>
-                <w:szCs w:val="16"/>
+                <w:szCs w:val="24"/>
               </w:rPr>
               <w:t>{NUNC_6}</w:t>
             </w:r>
@@ -778,6 +789,7 @@
               <w:rPr>
                 <w:rFonts w:cs="Arial"/>
                 <w:b/>
+                <w:szCs w:val="24"/>
               </w:rPr>
             </w:pPr>
             <w:r>
@@ -785,7 +797,7 @@
                 <w:rFonts w:eastAsia="Tahoma"/>
                 <w:b/>
                 <w:spacing w:val="-1"/>
-                <w:szCs w:val="16"/>
+                <w:szCs w:val="24"/>
               </w:rPr>
               <w:t>{NUNC_7}</w:t>
             </w:r>
@@ -808,6 +820,7 @@
               <w:rPr>
                 <w:rFonts w:cs="Arial"/>
                 <w:b/>
+                <w:szCs w:val="24"/>
               </w:rPr>
             </w:pPr>
             <w:r>
@@ -815,7 +828,7 @@
                 <w:rFonts w:eastAsia="Tahoma"/>
                 <w:b/>
                 <w:spacing w:val="-1"/>
-                <w:szCs w:val="16"/>
+                <w:szCs w:val="24"/>
               </w:rPr>
               <w:t>{NUNC_8}</w:t>
             </w:r>
@@ -838,6 +851,7 @@
               <w:rPr>
                 <w:rFonts w:cs="Arial"/>
                 <w:b/>
+                <w:szCs w:val="24"/>
               </w:rPr>
             </w:pPr>
             <w:r>
@@ -845,27 +859,9 @@
                 <w:rFonts w:eastAsia="Tahoma"/>
                 <w:b/>
                 <w:spacing w:val="-1"/>
-                <w:szCs w:val="16"/>
-              </w:rPr>
-              <w:t>{NUNC_</w:t>
-            </w:r>
-            <w:r>
-              <w:rPr>
-                <w:rFonts w:eastAsia="Tahoma"/>
-                <w:b/>
-                <w:spacing w:val="-1"/>
-                <w:szCs w:val="16"/>
-              </w:rPr>
-              <w:t>9</w:t>
-            </w:r>
-            <w:r>
-              <w:rPr>
-                <w:rFonts w:eastAsia="Tahoma"/>
-                <w:b/>
-                <w:spacing w:val="-1"/>
-                <w:szCs w:val="16"/>
-              </w:rPr>
-              <w:t>}</w:t>
+                <w:szCs w:val="24"/>
+              </w:rPr>
+              <w:t>{NUNC_9}</w:t>
             </w:r>
           </w:p>
         </w:tc>
@@ -886,6 +882,7 @@
               <w:rPr>
                 <w:rFonts w:cs="Arial"/>
                 <w:b/>
+                <w:szCs w:val="24"/>
               </w:rPr>
             </w:pPr>
             <w:r>
@@ -893,7 +890,7 @@
                 <w:rFonts w:eastAsia="Tahoma"/>
                 <w:b/>
                 <w:spacing w:val="-1"/>
-                <w:szCs w:val="16"/>
+                <w:szCs w:val="24"/>
               </w:rPr>
               <w:t>{NUNC_10}</w:t>
             </w:r>
@@ -916,6 +913,7 @@
               <w:rPr>
                 <w:rFonts w:cs="Arial"/>
                 <w:b/>
+                <w:szCs w:val="24"/>
               </w:rPr>
             </w:pPr>
             <w:r>
@@ -923,7 +921,7 @@
                 <w:rFonts w:eastAsia="Tahoma"/>
                 <w:b/>
                 <w:spacing w:val="-1"/>
-                <w:szCs w:val="16"/>
+                <w:szCs w:val="24"/>
               </w:rPr>
               <w:t>{NUNC_11}</w:t>
             </w:r>
@@ -946,6 +944,7 @@
               <w:rPr>
                 <w:rFonts w:cs="Arial"/>
                 <w:b/>
+                <w:szCs w:val="24"/>
               </w:rPr>
             </w:pPr>
             <w:r>
@@ -953,7 +952,7 @@
                 <w:rFonts w:eastAsia="Tahoma"/>
                 <w:b/>
                 <w:spacing w:val="-1"/>
-                <w:szCs w:val="16"/>
+                <w:szCs w:val="24"/>
               </w:rPr>
               <w:t>{NUNC_12}</w:t>
             </w:r>
@@ -976,6 +975,7 @@
               <w:rPr>
                 <w:rFonts w:cs="Arial"/>
                 <w:b/>
+                <w:szCs w:val="24"/>
               </w:rPr>
             </w:pPr>
             <w:r>
@@ -983,7 +983,7 @@
                 <w:rFonts w:eastAsia="Tahoma"/>
                 <w:b/>
                 <w:spacing w:val="-1"/>
-                <w:szCs w:val="16"/>
+                <w:szCs w:val="24"/>
               </w:rPr>
               <w:t>{NUNC_13}</w:t>
             </w:r>
@@ -1006,6 +1006,7 @@
               <w:rPr>
                 <w:rFonts w:cs="Arial"/>
                 <w:b/>
+                <w:szCs w:val="24"/>
               </w:rPr>
             </w:pPr>
             <w:r>
@@ -1013,7 +1014,7 @@
                 <w:rFonts w:eastAsia="Tahoma"/>
                 <w:b/>
                 <w:spacing w:val="-1"/>
-                <w:szCs w:val="16"/>
+                <w:szCs w:val="24"/>
               </w:rPr>
               <w:t>{NUNC_14}</w:t>
             </w:r>
@@ -1036,6 +1037,7 @@
               <w:rPr>
                 <w:rFonts w:cs="Arial"/>
                 <w:b/>
+                <w:szCs w:val="24"/>
               </w:rPr>
             </w:pPr>
             <w:r>
@@ -1043,9 +1045,27 @@
                 <w:rFonts w:eastAsia="Tahoma"/>
                 <w:b/>
                 <w:spacing w:val="-1"/>
-                <w:szCs w:val="16"/>
-              </w:rPr>
-              <w:t>{NUNC_14}</w:t>
+                <w:szCs w:val="24"/>
+              </w:rPr>
+              <w:t>{NUNC_1</w:t>
+            </w:r>
+            <w:r>
+              <w:rPr>
+                <w:rFonts w:eastAsia="Tahoma"/>
+                <w:b/>
+                <w:spacing w:val="-1"/>
+                <w:szCs w:val="24"/>
+              </w:rPr>
+              <w:t>5</w:t>
+            </w:r>
+            <w:r>
+              <w:rPr>
+                <w:rFonts w:eastAsia="Tahoma"/>
+                <w:b/>
+                <w:spacing w:val="-1"/>
+                <w:szCs w:val="24"/>
+              </w:rPr>
+              <w:t>}</w:t>
             </w:r>
           </w:p>
         </w:tc>
@@ -1066,6 +1086,7 @@
               <w:rPr>
                 <w:rFonts w:cs="Arial"/>
                 <w:b/>
+                <w:szCs w:val="24"/>
               </w:rPr>
             </w:pPr>
             <w:r>
@@ -1073,7 +1094,7 @@
                 <w:rFonts w:eastAsia="Tahoma"/>
                 <w:b/>
                 <w:spacing w:val="-1"/>
-                <w:szCs w:val="16"/>
+                <w:szCs w:val="24"/>
               </w:rPr>
               <w:t>{NUNC_16}</w:t>
             </w:r>
@@ -1096,6 +1117,7 @@
               <w:rPr>
                 <w:rFonts w:cs="Arial"/>
                 <w:b/>
+                <w:szCs w:val="24"/>
               </w:rPr>
             </w:pPr>
             <w:r>
@@ -1103,7 +1125,7 @@
                 <w:rFonts w:eastAsia="Tahoma"/>
                 <w:b/>
                 <w:spacing w:val="-1"/>
-                <w:szCs w:val="16"/>
+                <w:szCs w:val="24"/>
               </w:rPr>
               <w:t>{NUNC_17}</w:t>
             </w:r>
@@ -1126,6 +1148,7 @@
               <w:rPr>
                 <w:rFonts w:cs="Arial"/>
                 <w:b/>
+                <w:szCs w:val="24"/>
               </w:rPr>
             </w:pPr>
             <w:r>
@@ -1133,7 +1156,7 @@
                 <w:rFonts w:eastAsia="Tahoma"/>
                 <w:b/>
                 <w:spacing w:val="-1"/>
-                <w:szCs w:val="16"/>
+                <w:szCs w:val="24"/>
               </w:rPr>
               <w:t>{NUNC_18}</w:t>
             </w:r>
@@ -1156,6 +1179,7 @@
               <w:rPr>
                 <w:rFonts w:cs="Arial"/>
                 <w:b/>
+                <w:szCs w:val="24"/>
               </w:rPr>
             </w:pPr>
             <w:r>
@@ -1163,7 +1187,7 @@
                 <w:rFonts w:eastAsia="Tahoma"/>
                 <w:b/>
                 <w:spacing w:val="-1"/>
-                <w:szCs w:val="16"/>
+                <w:szCs w:val="24"/>
               </w:rPr>
               <w:t>{NUNC_19}</w:t>
             </w:r>
@@ -1186,6 +1210,7 @@
               <w:rPr>
                 <w:rFonts w:cs="Arial"/>
                 <w:b/>
+                <w:szCs w:val="24"/>
               </w:rPr>
             </w:pPr>
             <w:r>
@@ -1193,13 +1218,14 @@
                 <w:rFonts w:eastAsia="Tahoma"/>
                 <w:b/>
                 <w:spacing w:val="-1"/>
-                <w:szCs w:val="16"/>
+                <w:szCs w:val="24"/>
               </w:rPr>
               <w:t>{NUNC_20}</w:t>
             </w:r>
           </w:p>
         </w:tc>
       </w:tr>
+      <w:bookmarkEnd w:id="0"/>
       <w:tr>
         <w:trPr>
           <w:trHeight w:hRule="exact" w:val="240"/>
@@ -2598,8 +2624,8 @@
         <w:tblLook w:val="01E0" w:firstRow="1" w:lastRow="1" w:firstColumn="1" w:lastColumn="1" w:noHBand="0" w:noVBand="0"/>
       </w:tblPr>
       <w:tblGrid>
-        <w:gridCol w:w="2178"/>
-        <w:gridCol w:w="8346"/>
+        <w:gridCol w:w="2545"/>
+        <w:gridCol w:w="7979"/>
       </w:tblGrid>
       <w:tr>
         <w:trPr>
@@ -2608,7 +2634,7 @@
         </w:trPr>
         <w:tc>
           <w:tcPr>
-            <w:tcW w:w="1035" w:type="pct"/>
+            <w:tcW w:w="1209" w:type="pct"/>
             <w:tcBorders>
               <w:top w:val="single" w:sz="8" w:space="0" w:color="auto"/>
               <w:left w:val="single" w:sz="6" w:space="0" w:color="000000"/>
@@ -2622,6 +2648,7 @@
               <w:rPr>
                 <w:rFonts w:eastAsia="Tahoma" w:cs="Arial"/>
                 <w:spacing w:val="-1"/>
+                <w:sz w:val="22"/>
                 <w:szCs w:val="16"/>
               </w:rPr>
             </w:pPr>
@@ -2629,6 +2656,7 @@
               <w:rPr>
                 <w:rFonts w:eastAsia="Tahoma" w:cs="Arial"/>
                 <w:spacing w:val="-1"/>
+                <w:sz w:val="22"/>
                 <w:szCs w:val="16"/>
               </w:rPr>
               <w:t>Señor (a)</w:t>
@@ -2637,7 +2665,7 @@
         </w:tc>
         <w:tc>
           <w:tcPr>
-            <w:tcW w:w="3965" w:type="pct"/>
+            <w:tcW w:w="3791" w:type="pct"/>
             <w:tcBorders>
               <w:top w:val="single" w:sz="8" w:space="0" w:color="auto"/>
               <w:left w:val="single" w:sz="6" w:space="0" w:color="000000"/>
@@ -2653,6 +2681,7 @@
                 <w:rFonts w:eastAsia="Tahoma" w:cs="Arial"/>
                 <w:b/>
                 <w:spacing w:val="-1"/>
+                <w:sz w:val="22"/>
                 <w:szCs w:val="16"/>
               </w:rPr>
             </w:pPr>
@@ -2661,6 +2690,7 @@
                 <w:rFonts w:eastAsia="Tahoma" w:cs="Arial"/>
                 <w:b/>
                 <w:spacing w:val="-1"/>
+                <w:sz w:val="22"/>
                 <w:szCs w:val="16"/>
               </w:rPr>
               <w:t>{NOMBRE}</w:t>
@@ -2675,7 +2705,7 @@
         </w:trPr>
         <w:tc>
           <w:tcPr>
-            <w:tcW w:w="1035" w:type="pct"/>
+            <w:tcW w:w="1209" w:type="pct"/>
             <w:tcBorders>
               <w:top w:val="single" w:sz="8" w:space="0" w:color="auto"/>
               <w:left w:val="single" w:sz="6" w:space="0" w:color="000000"/>
@@ -2689,6 +2719,7 @@
               <w:rPr>
                 <w:rFonts w:eastAsia="Tahoma" w:cs="Arial"/>
                 <w:spacing w:val="-1"/>
+                <w:sz w:val="22"/>
                 <w:szCs w:val="16"/>
               </w:rPr>
             </w:pPr>
@@ -2696,6 +2727,7 @@
               <w:rPr>
                 <w:rFonts w:eastAsia="Tahoma" w:cs="Arial"/>
                 <w:spacing w:val="-1"/>
+                <w:sz w:val="22"/>
                 <w:szCs w:val="16"/>
               </w:rPr>
               <w:t>Dirección</w:t>
@@ -2704,7 +2736,7 @@
         </w:tc>
         <w:tc>
           <w:tcPr>
-            <w:tcW w:w="3965" w:type="pct"/>
+            <w:tcW w:w="3791" w:type="pct"/>
             <w:tcBorders>
               <w:top w:val="single" w:sz="8" w:space="0" w:color="auto"/>
               <w:left w:val="single" w:sz="6" w:space="0" w:color="000000"/>
@@ -2720,6 +2752,7 @@
                 <w:rFonts w:eastAsia="Tahoma" w:cs="Arial"/>
                 <w:b/>
                 <w:spacing w:val="-1"/>
+                <w:sz w:val="22"/>
                 <w:szCs w:val="16"/>
               </w:rPr>
             </w:pPr>
@@ -2728,6 +2761,7 @@
                 <w:rFonts w:eastAsia="Tahoma" w:cs="Arial"/>
                 <w:b/>
                 <w:spacing w:val="-1"/>
+                <w:sz w:val="22"/>
                 <w:szCs w:val="16"/>
               </w:rPr>
               <w:t>{</w:t>
@@ -2738,6 +2772,7 @@
                 <w:rFonts w:eastAsia="Tahoma" w:cs="Arial"/>
                 <w:b/>
                 <w:spacing w:val="-1"/>
+                <w:sz w:val="22"/>
                 <w:szCs w:val="16"/>
               </w:rPr>
               <w:t>DIRECCION</w:t>
@@ -2748,6 +2783,7 @@
                 <w:rFonts w:eastAsia="Tahoma" w:cs="Arial"/>
                 <w:b/>
                 <w:spacing w:val="-1"/>
+                <w:sz w:val="22"/>
                 <w:szCs w:val="16"/>
               </w:rPr>
               <w:t>}</w:t>
@@ -2762,7 +2798,7 @@
         </w:trPr>
         <w:tc>
           <w:tcPr>
-            <w:tcW w:w="1035" w:type="pct"/>
+            <w:tcW w:w="1209" w:type="pct"/>
             <w:tcBorders>
               <w:top w:val="single" w:sz="8" w:space="0" w:color="auto"/>
               <w:left w:val="single" w:sz="6" w:space="0" w:color="000000"/>
@@ -2776,6 +2812,7 @@
               <w:rPr>
                 <w:rFonts w:eastAsia="Tahoma" w:cs="Arial"/>
                 <w:spacing w:val="-1"/>
+                <w:sz w:val="22"/>
                 <w:szCs w:val="16"/>
               </w:rPr>
             </w:pPr>
@@ -2783,6 +2820,7 @@
               <w:rPr>
                 <w:rFonts w:eastAsia="Tahoma" w:cs="Arial"/>
                 <w:spacing w:val="-1"/>
+                <w:sz w:val="22"/>
                 <w:szCs w:val="16"/>
               </w:rPr>
               <w:t>Correo electrónico</w:t>
@@ -2791,7 +2829,7 @@
         </w:tc>
         <w:tc>
           <w:tcPr>
-            <w:tcW w:w="3965" w:type="pct"/>
+            <w:tcW w:w="3791" w:type="pct"/>
             <w:tcBorders>
               <w:top w:val="single" w:sz="8" w:space="0" w:color="auto"/>
               <w:left w:val="single" w:sz="6" w:space="0" w:color="000000"/>
@@ -2807,6 +2845,7 @@
                 <w:rFonts w:eastAsia="Tahoma" w:cs="Arial"/>
                 <w:b/>
                 <w:spacing w:val="-1"/>
+                <w:sz w:val="22"/>
                 <w:szCs w:val="16"/>
               </w:rPr>
             </w:pPr>
@@ -2815,6 +2854,7 @@
                 <w:rFonts w:eastAsia="Tahoma" w:cs="Arial"/>
                 <w:b/>
                 <w:spacing w:val="-1"/>
+                <w:sz w:val="22"/>
                 <w:szCs w:val="16"/>
               </w:rPr>
               <w:t>{CORREO}</w:t>
@@ -2829,7 +2869,7 @@
         </w:trPr>
         <w:tc>
           <w:tcPr>
-            <w:tcW w:w="1035" w:type="pct"/>
+            <w:tcW w:w="1209" w:type="pct"/>
             <w:tcBorders>
               <w:top w:val="single" w:sz="8" w:space="0" w:color="auto"/>
               <w:left w:val="single" w:sz="6" w:space="0" w:color="000000"/>
@@ -2843,6 +2883,7 @@
               <w:rPr>
                 <w:rFonts w:eastAsia="Tahoma" w:cs="Arial"/>
                 <w:spacing w:val="-1"/>
+                <w:sz w:val="22"/>
                 <w:szCs w:val="16"/>
               </w:rPr>
             </w:pPr>
@@ -2850,6 +2891,7 @@
               <w:rPr>
                 <w:rFonts w:eastAsia="Tahoma" w:cs="Arial"/>
                 <w:spacing w:val="-1"/>
+                <w:sz w:val="22"/>
                 <w:szCs w:val="16"/>
               </w:rPr>
               <w:t>Ciudad</w:t>
@@ -2858,7 +2900,7 @@
         </w:tc>
         <w:tc>
           <w:tcPr>
-            <w:tcW w:w="3965" w:type="pct"/>
+            <w:tcW w:w="3791" w:type="pct"/>
             <w:tcBorders>
               <w:top w:val="single" w:sz="8" w:space="0" w:color="auto"/>
               <w:left w:val="single" w:sz="6" w:space="0" w:color="000000"/>
@@ -2874,6 +2916,7 @@
                 <w:rFonts w:eastAsia="Tahoma" w:cs="Arial"/>
                 <w:b/>
                 <w:spacing w:val="-1"/>
+                <w:sz w:val="22"/>
                 <w:szCs w:val="16"/>
               </w:rPr>
             </w:pPr>
@@ -2882,6 +2925,7 @@
                 <w:rFonts w:eastAsia="Tahoma" w:cs="Arial"/>
                 <w:b/>
                 <w:spacing w:val="-1"/>
+                <w:sz w:val="22"/>
                 <w:szCs w:val="16"/>
               </w:rPr>
               <w:t>{CIUDAD}</w:t>
@@ -2907,7 +2951,7 @@
       </w:tblGrid>
       <w:tr>
         <w:trPr>
-          <w:trHeight w:hRule="exact" w:val="1531"/>
+          <w:trHeight w:hRule="exact" w:val="1134"/>
           <w:jc w:val="center"/>
         </w:trPr>
         <w:tc>
@@ -2938,10 +2982,28 @@
                 <w:sz w:val="22"/>
                 <w:szCs w:val="16"/>
               </w:rPr>
-              <w:t>{MOTIVO_CITACION}</w:t>
-            </w:r>
-            <w:bookmarkStart w:id="0" w:name="_GoBack"/>
-            <w:bookmarkEnd w:id="0"/>
+              <w:t>{</w:t>
+            </w:r>
+            <w:proofErr w:type="spellStart"/>
+            <w:r>
+              <w:rPr>
+                <w:rFonts w:eastAsia="Tahoma" w:cs="Arial"/>
+                <w:spacing w:val="-1"/>
+                <w:sz w:val="22"/>
+                <w:szCs w:val="16"/>
+              </w:rPr>
+              <w:t>MOTIVO_CITACION</w:t>
+            </w:r>
+            <w:proofErr w:type="spellEnd"/>
+            <w:r>
+              <w:rPr>
+                <w:rFonts w:eastAsia="Tahoma" w:cs="Arial"/>
+                <w:spacing w:val="-1"/>
+                <w:sz w:val="22"/>
+                <w:szCs w:val="16"/>
+              </w:rPr>
+              <w:t>}</w:t>
+            </w:r>
           </w:p>
         </w:tc>
       </w:tr>
@@ -2987,14 +3049,16 @@
               <w:rPr>
                 <w:rFonts w:eastAsia="Tahoma" w:cs="Arial"/>
                 <w:spacing w:val="-1"/>
-                <w:szCs w:val="16"/>
-              </w:rPr>
-            </w:pPr>
-            <w:r>
-              <w:rPr>
-                <w:rFonts w:eastAsia="Tahoma" w:cs="Arial"/>
-                <w:spacing w:val="-1"/>
-                <w:szCs w:val="16"/>
+                <w:sz w:val="22"/>
+                <w:szCs w:val="22"/>
+              </w:rPr>
+            </w:pPr>
+            <w:r>
+              <w:rPr>
+                <w:rFonts w:eastAsia="Tahoma" w:cs="Arial"/>
+                <w:spacing w:val="-1"/>
+                <w:sz w:val="22"/>
+                <w:szCs w:val="22"/>
               </w:rPr>
               <w:t>Debe asistir con abogado</w:t>
             </w:r>
@@ -3016,14 +3080,16 @@
               <w:rPr>
                 <w:rFonts w:eastAsia="Tahoma" w:cs="Arial"/>
                 <w:spacing w:val="-1"/>
-                <w:szCs w:val="16"/>
-              </w:rPr>
-            </w:pPr>
-            <w:r>
-              <w:rPr>
-                <w:rFonts w:eastAsia="Tahoma" w:cs="Arial"/>
-                <w:spacing w:val="-1"/>
-                <w:szCs w:val="16"/>
+                <w:sz w:val="22"/>
+                <w:szCs w:val="22"/>
+              </w:rPr>
+            </w:pPr>
+            <w:r>
+              <w:rPr>
+                <w:rFonts w:eastAsia="Tahoma" w:cs="Arial"/>
+                <w:spacing w:val="-1"/>
+                <w:sz w:val="22"/>
+                <w:szCs w:val="22"/>
               </w:rPr>
               <w:t>SI</w:t>
             </w:r>
@@ -3045,16 +3111,17 @@
               <w:rPr>
                 <w:rFonts w:eastAsia="Tahoma" w:cs="Arial"/>
                 <w:spacing w:val="-1"/>
-                <w:szCs w:val="16"/>
-              </w:rPr>
-            </w:pPr>
-            <w:r>
-              <w:rPr>
-                <w:rFonts w:eastAsia="Tahoma" w:cs="Arial"/>
-                <w:b/>
-                <w:spacing w:val="-1"/>
                 <w:sz w:val="22"/>
-                <w:szCs w:val="16"/>
+                <w:szCs w:val="22"/>
+              </w:rPr>
+            </w:pPr>
+            <w:r>
+              <w:rPr>
+                <w:rFonts w:eastAsia="Tahoma" w:cs="Arial"/>
+                <w:b/>
+                <w:spacing w:val="-1"/>
+                <w:sz w:val="22"/>
+                <w:szCs w:val="22"/>
               </w:rPr>
               <w:t>{</w:t>
             </w:r>
@@ -3065,7 +3132,7 @@
                 <w:b/>
                 <w:spacing w:val="-1"/>
                 <w:sz w:val="22"/>
-                <w:szCs w:val="16"/>
+                <w:szCs w:val="22"/>
               </w:rPr>
               <w:t>REQUIE</w:t>
             </w:r>
@@ -3073,7 +3140,8 @@
               <w:rPr>
                 <w:rFonts w:eastAsia="Tahoma" w:cs="Arial"/>
                 <w:spacing w:val="-1"/>
-                <w:szCs w:val="16"/>
+                <w:sz w:val="22"/>
+                <w:szCs w:val="22"/>
               </w:rPr>
               <w:t>RE_SI</w:t>
             </w:r>
@@ -3082,7 +3150,8 @@
               <w:rPr>
                 <w:rFonts w:eastAsia="Tahoma" w:cs="Arial"/>
                 <w:spacing w:val="-1"/>
-                <w:szCs w:val="16"/>
+                <w:sz w:val="22"/>
+                <w:szCs w:val="22"/>
               </w:rPr>
               <w:t>}</w:t>
             </w:r>
@@ -3104,14 +3173,16 @@
               <w:rPr>
                 <w:rFonts w:eastAsia="Tahoma" w:cs="Arial"/>
                 <w:spacing w:val="-1"/>
-                <w:szCs w:val="16"/>
-              </w:rPr>
-            </w:pPr>
-            <w:r>
-              <w:rPr>
-                <w:rFonts w:eastAsia="Tahoma" w:cs="Arial"/>
-                <w:spacing w:val="-1"/>
-                <w:szCs w:val="16"/>
+                <w:sz w:val="22"/>
+                <w:szCs w:val="22"/>
+              </w:rPr>
+            </w:pPr>
+            <w:r>
+              <w:rPr>
+                <w:rFonts w:eastAsia="Tahoma" w:cs="Arial"/>
+                <w:spacing w:val="-1"/>
+                <w:sz w:val="22"/>
+                <w:szCs w:val="22"/>
               </w:rPr>
               <w:t>NO</w:t>
             </w:r>
@@ -3134,15 +3205,17 @@
                 <w:rFonts w:eastAsia="Tahoma" w:cs="Arial"/>
                 <w:b/>
                 <w:spacing w:val="-1"/>
-                <w:szCs w:val="16"/>
-              </w:rPr>
-            </w:pPr>
-            <w:r>
-              <w:rPr>
-                <w:rFonts w:eastAsia="Tahoma" w:cs="Arial"/>
-                <w:b/>
-                <w:spacing w:val="-1"/>
-                <w:szCs w:val="16"/>
+                <w:sz w:val="22"/>
+                <w:szCs w:val="22"/>
+              </w:rPr>
+            </w:pPr>
+            <w:r>
+              <w:rPr>
+                <w:rFonts w:eastAsia="Tahoma" w:cs="Arial"/>
+                <w:b/>
+                <w:spacing w:val="-1"/>
+                <w:sz w:val="22"/>
+                <w:szCs w:val="22"/>
               </w:rPr>
               <w:t>{</w:t>
             </w:r>
@@ -3152,7 +3225,8 @@
                 <w:rFonts w:eastAsia="Tahoma" w:cs="Arial"/>
                 <w:b/>
                 <w:spacing w:val="-1"/>
-                <w:szCs w:val="16"/>
+                <w:sz w:val="22"/>
+                <w:szCs w:val="22"/>
               </w:rPr>
               <w:t>REQUIERE_NO</w:t>
             </w:r>
@@ -3162,7 +3236,8 @@
                 <w:rFonts w:eastAsia="Tahoma" w:cs="Arial"/>
                 <w:b/>
                 <w:spacing w:val="-1"/>
-                <w:szCs w:val="16"/>
+                <w:sz w:val="22"/>
+                <w:szCs w:val="22"/>
               </w:rPr>
               <w:t>}</w:t>
             </w:r>
@@ -3181,7 +3256,8 @@
               <w:rPr>
                 <w:rFonts w:eastAsia="Tahoma" w:cs="Arial"/>
                 <w:spacing w:val="-1"/>
-                <w:szCs w:val="16"/>
+                <w:sz w:val="22"/>
+                <w:szCs w:val="22"/>
               </w:rPr>
             </w:pPr>
           </w:p>
@@ -3455,7 +3531,7 @@
       </w:tr>
       <w:tr>
         <w:trPr>
-          <w:trHeight w:val="850"/>
+          <w:trHeight w:val="680"/>
           <w:jc w:val="center"/>
         </w:trPr>
         <w:tc>
@@ -3869,7 +3945,7 @@
       </w:tr>
       <w:tr>
         <w:trPr>
-          <w:trHeight w:hRule="exact" w:val="624"/>
+          <w:trHeight w:hRule="exact" w:val="1020"/>
           <w:jc w:val="center"/>
         </w:trPr>
         <w:tc>
@@ -3949,34 +4025,11 @@
             <w:r>
               <w:rPr>
                 <w:rFonts w:eastAsia="Tahoma" w:cs="Arial"/>
-                <w:b/>
-                <w:sz w:val="16"/>
+                <w:spacing w:val="-1"/>
                 <w:szCs w:val="16"/>
               </w:rPr>
               <w:t>{FIRMA}</w:t>
             </w:r>
-          </w:p>
-          <w:p>
-            <w:pPr>
-              <w:ind w:left="328"/>
-              <w:jc w:val="center"/>
-              <w:rPr>
-                <w:rFonts w:eastAsia="Tahoma" w:cs="Arial"/>
-                <w:spacing w:val="-1"/>
-                <w:szCs w:val="16"/>
-              </w:rPr>
-            </w:pPr>
-          </w:p>
-          <w:p>
-            <w:pPr>
-              <w:ind w:left="328"/>
-              <w:jc w:val="center"/>
-              <w:rPr>
-                <w:rFonts w:eastAsia="Tahoma" w:cs="Arial"/>
-                <w:spacing w:val="-1"/>
-                <w:szCs w:val="16"/>
-              </w:rPr>
-            </w:pPr>
           </w:p>
         </w:tc>
       </w:tr>
@@ -10737,7 +10790,7 @@
 </file>
 
 <file path=customXml/itemProps1.xml><?xml version="1.0" encoding="utf-8"?>
-<ds:datastoreItem xmlns:ds="http://schemas.openxmlformats.org/officeDocument/2006/customXml" ds:itemID="{E0AE7D4D-D0C0-4F94-9C87-F023302542B7}">
+<ds:datastoreItem xmlns:ds="http://schemas.openxmlformats.org/officeDocument/2006/customXml" ds:itemID="{BBB55AD8-31B0-4DD1-BA91-25198832310A}">
   <ds:schemaRefs>
     <ds:schemaRef ds:uri="http://schemas.openxmlformats.org/officeDocument/2006/bibliography"/>
   </ds:schemaRefs>

</xml_diff>